<commit_message>
chore: update SIDPOL article and add new version
</commit_message>
<xml_diff>
--- a/SIDPOL_Articulo_Mejorado.docx
+++ b/SIDPOL_Articulo_Mejorado.docx
@@ -3695,6 +3695,66 @@
       <w:pPr>
         <w:spacing w:before="240" w:after="240" w:line="360" w:lineRule="auto"/>
         <w:ind w:left="360"/>
+        <w:rPr>
+          <w:rFonts w:ascii="Times New Roman" w:eastAsia="Times New Roman" w:hAnsi="Times New Roman" w:cs="Times New Roman"/>
+          <w:sz w:val="20"/>
+          <w:szCs w:val="20"/>
+        </w:rPr>
+      </w:pPr>
+      <w:r>
+        <w:rPr>
+          <w:rFonts w:ascii="Times New Roman" w:eastAsia="Times New Roman" w:hAnsi="Times New Roman" w:cs="Times New Roman"/>
+          <w:noProof/>
+          <w:sz w:val="20"/>
+          <w:szCs w:val="20"/>
+        </w:rPr>
+        <w:drawing>
+          <wp:inline distT="0" distB="0" distL="0" distR="0" wp14:anchorId="61C02204" wp14:editId="54C485EF">
+            <wp:extent cx="3356610" cy="1834515"/>
+            <wp:effectExtent l="0" t="0" r="0" b="0"/>
+            <wp:docPr id="1466207418" name="Imagen 5"/>
+            <wp:cNvGraphicFramePr>
+              <a:graphicFrameLocks xmlns:a="http://schemas.openxmlformats.org/drawingml/2006/main" noChangeAspect="1"/>
+            </wp:cNvGraphicFramePr>
+            <a:graphic xmlns:a="http://schemas.openxmlformats.org/drawingml/2006/main">
+              <a:graphicData uri="http://schemas.openxmlformats.org/drawingml/2006/picture">
+                <pic:pic xmlns:pic="http://schemas.openxmlformats.org/drawingml/2006/picture">
+                  <pic:nvPicPr>
+                    <pic:cNvPr id="1466207418" name="Imagen 1466207418"/>
+                    <pic:cNvPicPr/>
+                  </pic:nvPicPr>
+                  <pic:blipFill>
+                    <a:blip r:embed="rId17" cstate="print">
+                      <a:extLst>
+                        <a:ext uri="{28A0092B-C50C-407E-A947-70E740481C1C}">
+                          <a14:useLocalDpi xmlns:a14="http://schemas.microsoft.com/office/drawing/2010/main" val="0"/>
+                        </a:ext>
+                      </a:extLst>
+                    </a:blip>
+                    <a:stretch>
+                      <a:fillRect/>
+                    </a:stretch>
+                  </pic:blipFill>
+                  <pic:spPr>
+                    <a:xfrm>
+                      <a:off x="0" y="0"/>
+                      <a:ext cx="3356610" cy="1834515"/>
+                    </a:xfrm>
+                    <a:prstGeom prst="rect">
+                      <a:avLst/>
+                    </a:prstGeom>
+                  </pic:spPr>
+                </pic:pic>
+              </a:graphicData>
+            </a:graphic>
+          </wp:inline>
+        </w:drawing>
+      </w:r>
+    </w:p>
+    <w:p>
+      <w:pPr>
+        <w:spacing w:before="240" w:after="240" w:line="360" w:lineRule="auto"/>
+        <w:ind w:left="360"/>
         <w:jc w:val="center"/>
         <w:rPr>
           <w:rFonts w:ascii="Times New Roman" w:eastAsia="Times New Roman" w:hAnsi="Times New Roman" w:cs="Times New Roman"/>
@@ -3780,7 +3840,16 @@
           <w:sz w:val="20"/>
           <w:szCs w:val="20"/>
         </w:rPr>
-        <w:t>Incorporada como modelo base (baseline). Su interpretabilidad directa permite cuantificar el aporte marginal de cada variable predictora y establecer un piso de comparación estadística contra el que contrastar la ganancia del modelo ensamblado.</w:t>
+        <w:t xml:space="preserve">Incorporada como modelo base (baseline). Su interpretabilidad directa permite cuantificar el </w:t>
+      </w:r>
+      <w:r>
+        <w:rPr>
+          <w:rFonts w:ascii="Times New Roman" w:eastAsia="Times New Roman" w:hAnsi="Times New Roman" w:cs="Times New Roman"/>
+          <w:sz w:val="20"/>
+          <w:szCs w:val="20"/>
+        </w:rPr>
+        <w:lastRenderedPageBreak/>
+        <w:t>aporte marginal de cada variable predictora y establecer un piso de comparación estadística contra el que contrastar la ganancia del modelo ensamblado.</w:t>
       </w:r>
     </w:p>
     <w:p>
@@ -3821,16 +3890,7 @@
           <w:sz w:val="20"/>
           <w:szCs w:val="20"/>
         </w:rPr>
-        <w:t xml:space="preserve">El espacio de características quedó definido por cuatro variables predictoras (X): Año, Mes, Departamento codificado numéricamente mediante Label Encoding, y Tipo de Delito igualmente codificado [13][14]. por cuatro variables predictoras </w:t>
-      </w:r>
-      <w:r>
-        <w:rPr>
-          <w:rFonts w:ascii="Times New Roman" w:eastAsia="Times New Roman" w:hAnsi="Times New Roman" w:cs="Times New Roman"/>
-          <w:sz w:val="20"/>
-          <w:szCs w:val="20"/>
-        </w:rPr>
-        <w:lastRenderedPageBreak/>
-        <w:t>(X): Año, Mes, Departamento codificado numéricamente mediante Label Encoding, y Tipo de Delito igualmente codificado. La variable objetivo (y) correspondió al total de denuncias registradas por combinación de departamento, tipo de delito y período. Tras la transformación logarítmica, el dataset resultante fue particionado de forma estratificada: 80 % para entrenamiento (n = 5,208 instancias) y 20 % para validación independiente (n = 1,302 instancias).</w:t>
+        <w:t>El espacio de características quedó definido por cuatro variables predictoras (X): Año, Mes, Departamento codificado numéricamente mediante Label Encoding, y Tipo de Delito igualmente codificado [13][14]. por cuatro variables predictoras (X): Año, Mes, Departamento codificado numéricamente mediante Label Encoding, y Tipo de Delito igualmente codificado. La variable objetivo (y) correspondió al total de denuncias registradas por combinación de departamento, tipo de delito y período. Tras la transformación logarítmica, el dataset resultante fue particionado de forma estratificada: 80 % para entrenamiento (n = 5,208 instancias) y 20 % para validación independiente (n = 1,302 instancias).</w:t>
       </w:r>
     </w:p>
     <w:p>
@@ -3912,7 +3972,15 @@
           <w:sz w:val="20"/>
           <w:szCs w:val="20"/>
         </w:rPr>
-        <w:t>Concluida la fase de entrenamiento, ambos modelos fueron sometidos a un protocolo de evaluación estricto sobre el conjunto de validación independiente. Las métricas seleccionadas —R² Score, Mean Absolute Error (MAE) y Root Mean Squared Error (RMSE)— fueron elegidas por su capacidad complementaria: R² cuantifica la proporción de varianza explicada, mientras que MAE y RMSE expresan el error de pronóstico en las unidades originales del problema (número de delitos), facilitando su interpretación por tomadores de decisiones no técnicos.</w:t>
+        <w:t xml:space="preserve">Concluida la fase de entrenamiento, ambos modelos fueron sometidos a un protocolo de evaluación estricto sobre el conjunto de validación independiente. Las métricas seleccionadas —R² Score, Mean Absolute Error (MAE) y Root Mean Squared Error (RMSE)— fueron elegidas por su capacidad complementaria: R² cuantifica la proporción de varianza explicada, mientras que MAE y RMSE expresan el error de pronóstico en las unidades originales </w:t>
+      </w:r>
+      <w:r>
+        <w:rPr>
+          <w:rFonts w:ascii="Times New Roman" w:eastAsia="Times New Roman" w:hAnsi="Times New Roman" w:cs="Times New Roman"/>
+          <w:sz w:val="20"/>
+          <w:szCs w:val="20"/>
+        </w:rPr>
+        <w:t>del problema (número de delitos), facilitando su interpretación por tomadores de decisiones no técnicos.</w:t>
       </w:r>
     </w:p>
     <w:p>
@@ -4401,7 +4469,7 @@
                     <pic:cNvPicPr/>
                   </pic:nvPicPr>
                   <pic:blipFill>
-                    <a:blip r:embed="rId17" cstate="print">
+                    <a:blip r:embed="rId18" cstate="print">
                       <a:extLst>
                         <a:ext uri="{28A0092B-C50C-407E-A947-70E740481C1C}">
                           <a14:useLocalDpi xmlns:a14="http://schemas.microsoft.com/office/drawing/2010/main" val="0"/>
@@ -4490,6 +4558,7 @@
           <w:sz w:val="20"/>
           <w:szCs w:val="20"/>
         </w:rPr>
+        <w:lastRenderedPageBreak/>
         <w:t>En términos de error absoluto, el Random Forest comete en promedio 12.34 delitos de error por pronóstico (MAE), frente a los 48.71 de la Regresión Lineal —una reducción del 74.7 % en el error promedio—. El RMSE de 18.92 del modelo ganador refleja que incluso los errores más grandes se mantienen dentro de rangos operativamente manejables para la planificación de recursos policiales departamentales.</w:t>
       </w:r>
     </w:p>
@@ -4531,7 +4600,6 @@
           <w:sz w:val="20"/>
           <w:szCs w:val="20"/>
         </w:rPr>
-        <w:lastRenderedPageBreak/>
         <w:t>Conforme a los criterios de fairness establecidos en la fase de evaluación del plan CRISP-DM (Tabla 1), se ejecutó una auditoría de equidad algorítmica para detectar sesgos residuales que pudieran perjudicar a departamentos con menor densidad poblacional. El análisis comparó el error absoluto promedio (MAE) del Random Forest desagregado por región geográfica.</w:t>
       </w:r>
     </w:p>
@@ -4710,7 +4778,7 @@
                     <pic:cNvPicPr/>
                   </pic:nvPicPr>
                   <pic:blipFill>
-                    <a:blip r:embed="rId18" cstate="print">
+                    <a:blip r:embed="rId19" cstate="print">
                       <a:extLst>
                         <a:ext uri="{28A0092B-C50C-407E-A947-70E740481C1C}">
                           <a14:useLocalDpi xmlns:a14="http://schemas.microsoft.com/office/drawing/2010/main" val="0"/>
@@ -4848,7 +4916,7 @@
                     <pic:cNvPicPr/>
                   </pic:nvPicPr>
                   <pic:blipFill>
-                    <a:blip r:embed="rId19" cstate="print">
+                    <a:blip r:embed="rId20" cstate="print">
                       <a:extLst>
                         <a:ext uri="{28A0092B-C50C-407E-A947-70E740481C1C}">
                           <a14:useLocalDpi xmlns:a14="http://schemas.microsoft.com/office/drawing/2010/main" val="0"/>
@@ -4968,6 +5036,7 @@
           <w:sz w:val="20"/>
           <w:szCs w:val="20"/>
         </w:rPr>
+        <w:lastRenderedPageBreak/>
         <w:t>Backend</w:t>
       </w:r>
       <w:proofErr w:type="spellEnd"/>
@@ -5029,7 +5098,6 @@
           <w:sz w:val="20"/>
           <w:szCs w:val="20"/>
         </w:rPr>
-        <w:lastRenderedPageBreak/>
         <w:t xml:space="preserve">Motor de IA (Capa Predictiva): </w:t>
       </w:r>
       <w:r>
@@ -5521,7 +5589,15 @@
           <w:sz w:val="20"/>
           <w:szCs w:val="20"/>
         </w:rPr>
-        <w:t>El sistema registra automáticamente el error de pronóstico (MAE rolling) de cada consulta en el historial de auditoría de MySQL. Un proceso programado calcula semanalmente el MAE promedio de las últimas 500 pronósticos y lo contrasta con el umbral de producción establecido (MAE ≤ 25 delitos).</w:t>
+        <w:t xml:space="preserve">El sistema registra automáticamente el error de pronóstico (MAE rolling) de cada consulta en el </w:t>
+      </w:r>
+      <w:r>
+        <w:rPr>
+          <w:rFonts w:ascii="Times New Roman" w:eastAsia="Times New Roman" w:hAnsi="Times New Roman" w:cs="Times New Roman"/>
+          <w:sz w:val="20"/>
+          <w:szCs w:val="20"/>
+        </w:rPr>
+        <w:t>historial de auditoría de MySQL. Un proceso programado calcula semanalmente el MAE promedio de las últimas 500 pronósticos y lo contrasta con el umbral de producción establecido (MAE ≤ 25 delitos).</w:t>
       </w:r>
     </w:p>
     <w:p>
@@ -5553,15 +5629,7 @@
           <w:sz w:val="20"/>
           <w:szCs w:val="20"/>
         </w:rPr>
-        <w:t xml:space="preserve">Si el MAE rolling supera el umbral durante dos semanas consecutivas, o si el R² calculado sobre nuevas observaciones desciende por debajo de 0.85, se activa automáticamente una alerta en el </w:t>
-      </w:r>
-      <w:r>
-        <w:rPr>
-          <w:rFonts w:ascii="Times New Roman" w:eastAsia="Times New Roman" w:hAnsi="Times New Roman" w:cs="Times New Roman"/>
-          <w:sz w:val="20"/>
-          <w:szCs w:val="20"/>
-        </w:rPr>
-        <w:t>dashboard ejecutivo, indicando la necesidad de incorporar nuevos registros SIDPOL y reentrenar el modelo.</w:t>
+        <w:t>Si el MAE rolling supera el umbral durante dos semanas consecutivas, o si el R² calculado sobre nuevas observaciones desciende por debajo de 0.85, se activa automáticamente una alerta en el dashboard ejecutivo, indicando la necesidad de incorporar nuevos registros SIDPOL y reentrenar el modelo.</w:t>
       </w:r>
     </w:p>
     <w:p>
@@ -5703,6 +5771,7 @@
           <w:sz w:val="20"/>
           <w:szCs w:val="20"/>
         </w:rPr>
+        <w:lastRenderedPageBreak/>
         <w:t xml:space="preserve">En línea con el marco propuesto por Guo [4] para la fusión </w:t>
       </w:r>
       <w:proofErr w:type="gramStart"/>
@@ -5748,7 +5817,6 @@
           <w:sz w:val="20"/>
           <w:szCs w:val="20"/>
         </w:rPr>
-        <w:lastRenderedPageBreak/>
         <w:t>espacio-temporal</w:t>
       </w:r>
       <w:proofErr w:type="gramEnd"/>
@@ -5837,7 +5905,15 @@
           <w:sz w:val="20"/>
           <w:szCs w:val="20"/>
         </w:rPr>
-        <w:t>El presente artículo ha demostrado la viabilidad técnica y la pertinencia institucional del uso de Machine Learning Supervisado para anticipar la incidencia delictiva a nivel departamental en el Perú. Articulando los seis pasos de la metodología CRISP-DM con datos oficiales del SIDPOL, se logró construir un sistema de pronóstico de alta precisión (R² = 0.9247) que reduce el error de pronóstico en un 74.7 % respecto a una línea base lineal, al tiempo que garantiza equidad algorítmica entre regiones.</w:t>
+        <w:t xml:space="preserve">El presente artículo ha demostrado la viabilidad técnica y la pertinencia institucional del uso de Machine Learning Supervisado </w:t>
+      </w:r>
+      <w:r>
+        <w:rPr>
+          <w:rFonts w:ascii="Times New Roman" w:eastAsia="Times New Roman" w:hAnsi="Times New Roman" w:cs="Times New Roman"/>
+          <w:sz w:val="20"/>
+          <w:szCs w:val="20"/>
+        </w:rPr>
+        <w:t>para anticipar la incidencia delictiva a nivel departamental en el Perú. Articulando los seis pasos de la metodología CRISP-DM con datos oficiales del SIDPOL, se logró construir un sistema de pronóstico de alta precisión (R² = 0.9247) que reduce el error de pronóstico en un 74.7 % respecto a una línea base lineal, al tiempo que garantiza equidad algorítmica entre regiones.</w:t>
       </w:r>
     </w:p>
     <w:p>
@@ -5856,15 +5932,7 @@
           <w:sz w:val="20"/>
           <w:szCs w:val="20"/>
         </w:rPr>
-        <w:t xml:space="preserve">El modelo Random Forest Regressor, desplegado como microservicio Python e integrado en una arquitectura de tres capas </w:t>
-      </w:r>
-      <w:r>
-        <w:rPr>
-          <w:rFonts w:ascii="Times New Roman" w:eastAsia="Times New Roman" w:hAnsi="Times New Roman" w:cs="Times New Roman"/>
-          <w:sz w:val="20"/>
-          <w:szCs w:val="20"/>
-        </w:rPr>
-        <w:t>(Angular + Spring Boot + FastAPI), constituye una herramienta auditable y de alta disponibilidad que permite a los tomadores de decisiones del Ministerio del Interior analizar y proyectar tendencias criminales departamentales de forma intuitiva, sin necesidad de conocimientos técnicos en inteligencia artificial.</w:t>
+        <w:t>El modelo Random Forest Regressor, desplegado como microservicio Python e integrado en una arquitectura de tres capas (Angular + Spring Boot + FastAPI), constituye una herramienta auditable y de alta disponibilidad que permite a los tomadores de decisiones del Ministerio del Interior analizar y proyectar tendencias criminales departamentales de forma intuitiva, sin necesidad de conocimientos técnicos en inteligencia artificial.</w:t>
       </w:r>
     </w:p>
     <w:p>
@@ -6079,6 +6147,7 @@
           <w:szCs w:val="18"/>
           <w:lang w:val="en-US"/>
         </w:rPr>
+        <w:lastRenderedPageBreak/>
         <w:t xml:space="preserve">[3] </w:t>
       </w:r>
       <w:proofErr w:type="spellStart"/>
@@ -6218,7 +6287,6 @@
           <w:szCs w:val="18"/>
           <w:lang w:val="en-US"/>
         </w:rPr>
-        <w:lastRenderedPageBreak/>
         <w:t xml:space="preserve">[5] Hernández, D., Pulido, C., &amp; Gómez, F. (2026). Quantifying fairness in spatial predictive policing. </w:t>
       </w:r>
       <w:r>
@@ -6606,7 +6674,17 @@
           <w:szCs w:val="18"/>
           <w:lang w:val="en-US"/>
         </w:rPr>
-        <w:t>-Temporal Crime Predictions by Leveraging Artificial Intelligence for Citizens Security in Smart Cities. IEEE Access, 9, 47516–47529. https://doi.org/10.1109/access.2021.3068306</w:t>
+        <w:t xml:space="preserve">-Temporal Crime Predictions by Leveraging </w:t>
+      </w:r>
+      <w:r>
+        <w:rPr>
+          <w:rFonts w:ascii="Times New Roman" w:hAnsi="Times New Roman" w:cs="Times New Roman"/>
+          <w:color w:val="auto"/>
+          <w:sz w:val="18"/>
+          <w:szCs w:val="18"/>
+          <w:lang w:val="en-US"/>
+        </w:rPr>
+        <w:t>Artificial Intelligence for Citizens Security in Smart Cities. IEEE Access, 9, 47516–47529. https://doi.org/10.1109/access.2021.3068306</w:t>
       </w:r>
     </w:p>
     <w:p>

</xml_diff>